<commit_message>
final data analysis plan and report
</commit_message>
<xml_diff>
--- a/Project 4/Dissemination/Project 4 Data Analysis Plan.docx
+++ b/Project 4/Dissemination/Project 4 Data Analysis Plan.docx
@@ -2,26 +2,10 @@
 <file path=word/document.xml><?xml version="1.0" encoding="utf-8"?>
 <w:document xmlns:wpc="http://schemas.microsoft.com/office/word/2010/wordprocessingCanvas" xmlns:mc="http://schemas.openxmlformats.org/markup-compatibility/2006" xmlns:o="urn:schemas-microsoft-com:office:office" xmlns:r="http://schemas.openxmlformats.org/officeDocument/2006/relationships" xmlns:m="http://schemas.openxmlformats.org/officeDocument/2006/math" xmlns:v="urn:schemas-microsoft-com:vml" xmlns:wp14="http://schemas.microsoft.com/office/word/2010/wordprocessingDrawing" xmlns:wp="http://schemas.openxmlformats.org/drawingml/2006/wordprocessingDrawing" xmlns:w10="urn:schemas-microsoft-com:office:word" xmlns:w="http://schemas.openxmlformats.org/wordprocessingml/2006/main" xmlns:w14="http://schemas.microsoft.com/office/word/2010/wordml" xmlns:w15="http://schemas.microsoft.com/office/word/2012/wordml" xmlns:wpg="http://schemas.microsoft.com/office/word/2010/wordprocessingGroup" xmlns:wpi="http://schemas.microsoft.com/office/word/2010/wordprocessingInk" xmlns:wne="http://schemas.microsoft.com/office/word/2006/wordml" xmlns:wps="http://schemas.microsoft.com/office/word/2010/wordprocessingShape" xmlns:w16se="http://schemas.microsoft.com/office/word/2015/wordml/symex" xmlns:w16cid="http://schemas.microsoft.com/office/word/2016/wordml/cid" xmlns:w16="http://schemas.microsoft.com/office/word/2018/wordml" xmlns:w16cex="http://schemas.microsoft.com/office/word/2018/wordml/cex" xmlns:w16sdtdh="http://schemas.microsoft.com/office/word/2020/wordml/sdtdatahash" xmlns:w16sdtfl="http://schemas.microsoft.com/office/word/2024/wordml/sdtformatlock" mc:Ignorable="w14 w15 wp14 w16se w16cid w16 w16cex w16sdtdh w16sdtfl">
   <w:body>
-    <w:p xmlns:wp14="http://schemas.microsoft.com/office/word/2010/wordml" wp14:paraId="483A26CF" wp14:textId="01871D0B">
+    <w:p xmlns:wp14="http://schemas.microsoft.com/office/word/2010/wordml" wp14:paraId="483A26CF" wp14:textId="4278C646">
       <w:pPr>
         <w:spacing w:before="0" w:beforeAutospacing="off" w:after="0" w:afterAutospacing="off" w:line="480" w:lineRule="auto"/>
         <w:jc w:val="center"/>
-        <w:rPr>
-          <w:rFonts w:ascii="Times New Roman" w:hAnsi="Times New Roman" w:eastAsia="Times New Roman" w:cs="Times New Roman" w:asciiTheme="minorAscii" w:hAnsiTheme="minorAscii" w:eastAsiaTheme="minorAscii" w:cstheme="minorAscii"/>
-          <w:b w:val="0"/>
-          <w:bCs w:val="0"/>
-          <w:i w:val="0"/>
-          <w:iCs w:val="0"/>
-          <w:caps w:val="0"/>
-          <w:smallCaps w:val="0"/>
-          <w:noProof w:val="0"/>
-          <w:color w:val="000000" w:themeColor="text1" w:themeTint="FF" w:themeShade="FF"/>
-          <w:sz w:val="24"/>
-          <w:szCs w:val="24"/>
-          <w:lang w:val="en-US"/>
-        </w:rPr>
-      </w:pPr>
-      <w:r>
         <w:rPr>
           <w:rFonts w:ascii="Times New Roman" w:hAnsi="Times New Roman" w:eastAsia="Times New Roman" w:cs="Times New Roman" w:asciiTheme="minorAscii" w:hAnsiTheme="minorAscii" w:eastAsiaTheme="minorAscii" w:cstheme="minorAscii"/>
           <w:b w:val="1"/>
@@ -36,7 +20,23 @@
           <w:szCs w:val="24"/>
           <w:lang w:val="en-US"/>
         </w:rPr>
-        <w:t>Project 4 Data Analysis Plan</w:t>
+      </w:pPr>
+      <w:r>
+        <w:rPr>
+          <w:rFonts w:ascii="Times New Roman" w:hAnsi="Times New Roman" w:eastAsia="Times New Roman" w:cs="Times New Roman" w:asciiTheme="minorAscii" w:hAnsiTheme="minorAscii" w:eastAsiaTheme="minorAscii" w:cstheme="minorAscii"/>
+          <w:b w:val="1"/>
+          <w:bCs w:val="1"/>
+          <w:i w:val="0"/>
+          <w:iCs w:val="0"/>
+          <w:caps w:val="0"/>
+          <w:smallCaps w:val="0"/>
+          <w:noProof w:val="0"/>
+          <w:color w:val="000000" w:themeColor="text1" w:themeTint="FF" w:themeShade="FF"/>
+          <w:sz w:val="24"/>
+          <w:szCs w:val="24"/>
+          <w:lang w:val="en-US"/>
+        </w:rPr>
+        <w:t>Project 4 Final Report</w:t>
       </w:r>
     </w:p>
     <w:p xmlns:wp14="http://schemas.microsoft.com/office/word/2010/wordml" wp14:paraId="2ACA8CDA" wp14:textId="376D09B1">

</xml_diff>